<commit_message>
Atualiza o plano de testes da Sprint 4 para focar em Motos e Ocorrências, removendo testes de login e ajustando a documentação. Adiciona coleção e ambiente do Postman para testes automatizados da API.
</commit_message>
<xml_diff>
--- a/docs/Plano_de_Testes_LorArch_Sprint4_Completo.docx
+++ b/docs/Plano_de_Testes_LorArch_Sprint4_Completo.docx
@@ -45,7 +45,7 @@
     </w:p>
     <w:p>
       <w:r>
-        <w:t>Os testes manuais foram realizados para validar as principais funcionalidades do sistema LorArch, incluindo autenticação, CRUD de motos e gerenciamento de ocorrências.</w:t>
+        <w:t>Os testes manuais foram realizados para validar as principais funcionalidades do sistema LorArch, incluindo motos e ocorrências, CRUD de motos e gerenciamento de ocorrências.</w:t>
       </w:r>
     </w:p>
     <w:tbl>
@@ -108,7 +108,7 @@
           </w:tcPr>
           <w:p>
             <w:r>
-              <w:t>Login com credenciais válidas</w:t>
+              <w:t>Página Inicial / Listas com credenciais válidas</w:t>
             </w:r>
           </w:p>
         </w:tc>
@@ -150,7 +150,7 @@
           </w:tcPr>
           <w:p>
             <w:r>
-              <w:t>Login inválido</w:t>
+              <w:t>Página Inicial / Listas inválido</w:t>
             </w:r>
           </w:p>
         </w:tc>
@@ -322,7 +322,7 @@
     </w:p>
     <w:p>
       <w:r>
-        <w:t>Foram criados e executados testes automatizados utilizando o Postman, com foco na API Java do projeto LorArch. Os testes cobrem autenticação, cadastro, atualização e remoção de registros.</w:t>
+        <w:t>Foram criados e executados testes automatizados utilizando o Postman, com foco na API Java do projeto LorArch. Os testes cobrem motos e ocorrências, cadastro, atualização e remoção de registros.</w:t>
       </w:r>
     </w:p>
     <w:p>
@@ -367,6 +367,12 @@
     <w:p>
       <w:r>
         <w:t>Conclusão: o sistema LorArch atendeu aos critérios de qualidade definidos para a Sprint 4, garantindo estabilidade nas principais rotas da API e funcionamento esperado da interface web.</w:t>
+      </w:r>
+    </w:p>
+    <w:p/>
+    <w:p>
+      <w:r>
+        <w:t>Observação: Esta versão do plano foca exclusivamente em **Motos** e **Ocorrências** (CRUD + manutenção), alinhado ao escopo atual da Sprint 4. Testes de login/autenticação foram removidos do escopo.</w:t>
       </w:r>
     </w:p>
     <w:sectPr>

</xml_diff>